<commit_message>
Fix up exercise and solutions
</commit_message>
<xml_diff>
--- a/rsr_week_05_workshop/rsr_week_05_solutions.docx
+++ b/rsr_week_05_workshop/rsr_week_05_solutions.docx
@@ -9071,6 +9071,44 @@
         <w:pStyle w:val="FirstParagraph"/>
       </w:pPr>
       <w:r>
+        <w:t xml:space="preserve">In your prompt, also refer to the current</w:t>
+      </w:r>
+      <w:r>
+        <w:t xml:space="preserve"> </w:t>
+      </w:r>
+      <w:r>
+        <w:rPr>
+          <w:rStyle w:val="VerbatimChar"/>
+        </w:rPr>
+        <w:t xml:space="preserve">gt</w:t>
+      </w:r>
+      <w:r>
+        <w:t xml:space="preserve"> </w:t>
+      </w:r>
+      <w:r>
+        <w:t xml:space="preserve">code from the</w:t>
+      </w:r>
+      <w:r>
+        <w:t xml:space="preserve"> </w:t>
+      </w:r>
+      <w:r>
+        <w:rPr>
+          <w:rStyle w:val="VerbatimChar"/>
+        </w:rPr>
+        <w:t xml:space="preserve">render-table</w:t>
+      </w:r>
+      <w:r>
+        <w:t xml:space="preserve"> </w:t>
+      </w:r>
+      <w:r>
+        <w:t xml:space="preserve">chunk above.</w:t>
+      </w:r>
+    </w:p>
+    <w:p>
+      <w:pPr>
+        <w:pStyle w:val="BodyText"/>
+      </w:pPr>
+      <w:r>
         <w:t xml:space="preserve">One possible extension:</w:t>
       </w:r>
     </w:p>

</xml_diff>